<commit_message>
Forgot Password method Email is send for creating new password
</commit_message>
<xml_diff>
--- a/changes to make and log.docx
+++ b/changes to make and log.docx
@@ -686,6 +686,24 @@
       <w:r>
         <w:t xml:space="preserve">Not done yet </w:t>
       </w:r>
+      <w:r>
+        <w:t>//--------------</w:t>
+      </w:r>
+      <w:r>
+        <w:sym w:font="Wingdings" w:char="F0E0"/>
+      </w:r>
+      <w:r>
+        <w:t xml:space="preserve"> </w:t>
+      </w:r>
+      <w:r>
+        <w:rPr>
+          <w:highlight w:val="yellow"/>
+        </w:rPr>
+        <w:t>done but not cross checked</w:t>
+      </w:r>
+      <w:r>
+        <w:t xml:space="preserve"> </w:t>
+      </w:r>
     </w:p>
     <w:p>
       <w:pPr>
@@ -704,15 +722,332 @@
         </w:tabs>
       </w:pPr>
       <w:r>
-        <w:t xml:space="preserve">Student can delete the project till the time faculty did not sees it or you can say did </w:t>
-      </w:r>
-      <w:proofErr w:type="spellStart"/>
-      <w:r>
-        <w:t>nto</w:t>
-      </w:r>
-      <w:proofErr w:type="spellEnd"/>
-      <w:r>
-        <w:t xml:space="preserve"> took any action at that time </w:t>
+        <w:t xml:space="preserve">Student can delete the project till the time faculty did not sees </w:t>
+      </w:r>
+      <w:r>
+        <w:t>it or you can say did n</w:t>
+      </w:r>
+      <w:r>
+        <w:t>o</w:t>
+      </w:r>
+      <w:r>
+        <w:t>t took any action at that time.</w:t>
+      </w:r>
+    </w:p>
+    <w:p>
+      <w:pPr>
+        <w:tabs>
+          <w:tab w:val="left" w:pos="6552"/>
+        </w:tabs>
+      </w:pPr>
+      <w:r>
+        <w:t xml:space="preserve">Student can remove the faculty only when selected by himself in case the </w:t>
+      </w:r>
+      <w:proofErr w:type="spellStart"/>
+      <w:r>
+        <w:t>hod</w:t>
+      </w:r>
+      <w:proofErr w:type="spellEnd"/>
+      <w:r>
+        <w:t xml:space="preserve"> has assigned the faculty as the guide to any student he </w:t>
+      </w:r>
+      <w:proofErr w:type="spellStart"/>
+      <w:r>
+        <w:t>can not</w:t>
+      </w:r>
+      <w:proofErr w:type="spellEnd"/>
+      <w:r>
+        <w:t xml:space="preserve"> remove it </w:t>
+      </w:r>
+    </w:p>
+    <w:p>
+      <w:pPr>
+        <w:tabs>
+          <w:tab w:val="left" w:pos="6552"/>
+        </w:tabs>
+      </w:pPr>
+      <w:r>
+        <w:t xml:space="preserve">But the admin can delete the project </w:t>
+      </w:r>
+      <w:r>
+        <w:t xml:space="preserve">selected </w:t>
+      </w:r>
+      <w:proofErr w:type="spellStart"/>
+      <w:r>
+        <w:t>ro</w:t>
+      </w:r>
+      <w:proofErr w:type="spellEnd"/>
+      <w:r>
+        <w:t xml:space="preserve"> submitted by the student </w:t>
+      </w:r>
+      <w:r>
+        <w:t xml:space="preserve">at any time </w:t>
+      </w:r>
+      <w:r>
+        <w:t xml:space="preserve">and at </w:t>
+      </w:r>
+      <w:r>
+        <w:t xml:space="preserve">any status </w:t>
+      </w:r>
+    </w:p>
+    <w:p>
+      <w:pPr>
+        <w:tabs>
+          <w:tab w:val="left" w:pos="6552"/>
+        </w:tabs>
+      </w:pPr>
+      <w:r>
+        <w:t>Admin can also delete the branch, users</w:t>
+      </w:r>
+      <w:r>
+        <w:br/>
+      </w:r>
+    </w:p>
+    <w:p>
+      <w:pPr>
+        <w:tabs>
+          <w:tab w:val="left" w:pos="6552"/>
+        </w:tabs>
+      </w:pPr>
+    </w:p>
+    <w:p>
+      <w:pPr>
+        <w:tabs>
+          <w:tab w:val="left" w:pos="6552"/>
+        </w:tabs>
+        <w:rPr>
+          <w:rFonts w:ascii="Arial" w:hAnsi="Arial" w:cs="Arial"/>
+          <w:color w:val="F87171"/>
+          <w:sz w:val="17"/>
+          <w:szCs w:val="17"/>
+        </w:rPr>
+      </w:pPr>
+      <w:r>
+        <w:t xml:space="preserve">This error is coming when we are trying to reassign the faculty to the student </w:t>
+      </w:r>
+      <w:r>
+        <w:br/>
+      </w:r>
+      <w:r>
+        <w:rPr>
+          <w:rFonts w:ascii="Arial" w:hAnsi="Arial" w:cs="Arial"/>
+          <w:color w:val="F87171"/>
+          <w:sz w:val="17"/>
+          <w:szCs w:val="17"/>
+        </w:rPr>
+        <w:t xml:space="preserve">could not execute statement [Duplicate entry '11' for key 'guide_assignments.UKi04i3fqp91nhr7ffoj9xqjox1'] [insert into </w:t>
+      </w:r>
+      <w:proofErr w:type="spellStart"/>
+      <w:r>
+        <w:rPr>
+          <w:rFonts w:ascii="Arial" w:hAnsi="Arial" w:cs="Arial"/>
+          <w:color w:val="F87171"/>
+          <w:sz w:val="17"/>
+          <w:szCs w:val="17"/>
+        </w:rPr>
+        <w:t>guide_assignments</w:t>
+      </w:r>
+      <w:proofErr w:type="spellEnd"/>
+      <w:r>
+        <w:rPr>
+          <w:rFonts w:ascii="Arial" w:hAnsi="Arial" w:cs="Arial"/>
+          <w:color w:val="F87171"/>
+          <w:sz w:val="17"/>
+          <w:szCs w:val="17"/>
+        </w:rPr>
+        <w:t xml:space="preserve"> (assigned_at,assigned_by,branch_id,faculty_id,selection_form_id,student_id) values (?,?,?,?,?,?)]; SQL [insert into </w:t>
+      </w:r>
+      <w:proofErr w:type="spellStart"/>
+      <w:r>
+        <w:rPr>
+          <w:rFonts w:ascii="Arial" w:hAnsi="Arial" w:cs="Arial"/>
+          <w:color w:val="F87171"/>
+          <w:sz w:val="17"/>
+          <w:szCs w:val="17"/>
+        </w:rPr>
+        <w:t>guide_assignments</w:t>
+      </w:r>
+      <w:proofErr w:type="spellEnd"/>
+      <w:r>
+        <w:rPr>
+          <w:rFonts w:ascii="Arial" w:hAnsi="Arial" w:cs="Arial"/>
+          <w:color w:val="F87171"/>
+          <w:sz w:val="17"/>
+          <w:szCs w:val="17"/>
+        </w:rPr>
+        <w:t xml:space="preserve"> (assigned_at,assigned_by,branch_id,faculty_id,selection_form_id,student_id) values (?,?,?,?,?,?)]; constraint [guide_assignments.UKi04i3fqp91nhr7ffoj9xqjox1]</w:t>
+      </w:r>
+    </w:p>
+    <w:p>
+      <w:pPr>
+        <w:tabs>
+          <w:tab w:val="left" w:pos="6552"/>
+        </w:tabs>
+        <w:rPr>
+          <w:rFonts w:ascii="Arial" w:hAnsi="Arial" w:cs="Arial"/>
+          <w:color w:val="F87171"/>
+          <w:sz w:val="17"/>
+          <w:szCs w:val="17"/>
+        </w:rPr>
+      </w:pPr>
+    </w:p>
+    <w:p>
+      <w:pPr>
+        <w:tabs>
+          <w:tab w:val="left" w:pos="6552"/>
+        </w:tabs>
+      </w:pPr>
+      <w:r>
+        <w:t>//////////////////////////////////////////</w:t>
+      </w:r>
+    </w:p>
+    <w:p>
+      <w:pPr>
+        <w:tabs>
+          <w:tab w:val="left" w:pos="6552"/>
+        </w:tabs>
+      </w:pPr>
+      <w:r>
+        <w:rPr>
+          <w:noProof/>
+        </w:rPr>
+        <w:lastRenderedPageBreak/>
+        <w:drawing>
+          <wp:inline distT="0" distB="0" distL="0" distR="0">
+            <wp:extent cx="5943600" cy="2806539"/>
+            <wp:effectExtent l="19050" t="0" r="0" b="0"/>
+            <wp:docPr id="5" name="Picture 1"/>
+            <wp:cNvGraphicFramePr>
+              <a:graphicFrameLocks xmlns:a="http://schemas.openxmlformats.org/drawingml/2006/main" noChangeAspect="1"/>
+            </wp:cNvGraphicFramePr>
+            <a:graphic xmlns:a="http://schemas.openxmlformats.org/drawingml/2006/main">
+              <a:graphicData uri="http://schemas.openxmlformats.org/drawingml/2006/picture">
+                <pic:pic xmlns:pic="http://schemas.openxmlformats.org/drawingml/2006/picture">
+                  <pic:nvPicPr>
+                    <pic:cNvPr id="0" name="Picture 1"/>
+                    <pic:cNvPicPr>
+                      <a:picLocks noChangeAspect="1" noChangeArrowheads="1"/>
+                    </pic:cNvPicPr>
+                  </pic:nvPicPr>
+                  <pic:blipFill>
+                    <a:blip r:embed="rId13" cstate="print"/>
+                    <a:srcRect/>
+                    <a:stretch>
+                      <a:fillRect/>
+                    </a:stretch>
+                  </pic:blipFill>
+                  <pic:spPr bwMode="auto">
+                    <a:xfrm>
+                      <a:off x="0" y="0"/>
+                      <a:ext cx="5943600" cy="2806539"/>
+                    </a:xfrm>
+                    <a:prstGeom prst="rect">
+                      <a:avLst/>
+                    </a:prstGeom>
+                    <a:noFill/>
+                    <a:ln w="9525">
+                      <a:noFill/>
+                      <a:miter lim="800000"/>
+                      <a:headEnd/>
+                      <a:tailEnd/>
+                    </a:ln>
+                  </pic:spPr>
+                </pic:pic>
+              </a:graphicData>
+            </a:graphic>
+          </wp:inline>
+        </w:drawing>
+      </w:r>
+    </w:p>
+    <w:p>
+      <w:pPr>
+        <w:tabs>
+          <w:tab w:val="left" w:pos="1800"/>
+        </w:tabs>
+      </w:pPr>
+      <w:r>
+        <w:t xml:space="preserve">Bulk </w:t>
+      </w:r>
+      <w:proofErr w:type="spellStart"/>
+      <w:r>
+        <w:t>uplode</w:t>
+      </w:r>
+      <w:proofErr w:type="spellEnd"/>
+      <w:r>
+        <w:t xml:space="preserve"> the user using </w:t>
+      </w:r>
+      <w:proofErr w:type="spellStart"/>
+      <w:r>
+        <w:t>csv</w:t>
+      </w:r>
+      <w:proofErr w:type="spellEnd"/>
+      <w:r>
+        <w:t xml:space="preserve"> file like we did in the project topic time </w:t>
+      </w:r>
+    </w:p>
+    <w:p>
+      <w:pPr>
+        <w:tabs>
+          <w:tab w:val="left" w:pos="1800"/>
+        </w:tabs>
+      </w:pPr>
+      <w:r>
+        <w:rPr>
+          <w:noProof/>
+        </w:rPr>
+        <w:drawing>
+          <wp:inline distT="0" distB="0" distL="0" distR="0">
+            <wp:extent cx="2038350" cy="2576376"/>
+            <wp:effectExtent l="19050" t="0" r="0" b="0"/>
+            <wp:docPr id="6" name="Picture 4"/>
+            <wp:cNvGraphicFramePr>
+              <a:graphicFrameLocks xmlns:a="http://schemas.openxmlformats.org/drawingml/2006/main" noChangeAspect="1"/>
+            </wp:cNvGraphicFramePr>
+            <a:graphic xmlns:a="http://schemas.openxmlformats.org/drawingml/2006/main">
+              <a:graphicData uri="http://schemas.openxmlformats.org/drawingml/2006/picture">
+                <pic:pic xmlns:pic="http://schemas.openxmlformats.org/drawingml/2006/picture">
+                  <pic:nvPicPr>
+                    <pic:cNvPr id="0" name="Picture 4"/>
+                    <pic:cNvPicPr>
+                      <a:picLocks noChangeAspect="1" noChangeArrowheads="1"/>
+                    </pic:cNvPicPr>
+                  </pic:nvPicPr>
+                  <pic:blipFill>
+                    <a:blip r:embed="rId14" cstate="print"/>
+                    <a:srcRect/>
+                    <a:stretch>
+                      <a:fillRect/>
+                    </a:stretch>
+                  </pic:blipFill>
+                  <pic:spPr bwMode="auto">
+                    <a:xfrm>
+                      <a:off x="0" y="0"/>
+                      <a:ext cx="2039888" cy="2578320"/>
+                    </a:xfrm>
+                    <a:prstGeom prst="rect">
+                      <a:avLst/>
+                    </a:prstGeom>
+                    <a:noFill/>
+                    <a:ln w="9525">
+                      <a:noFill/>
+                      <a:miter lim="800000"/>
+                      <a:headEnd/>
+                      <a:tailEnd/>
+                    </a:ln>
+                  </pic:spPr>
+                </pic:pic>
+              </a:graphicData>
+            </a:graphic>
+          </wp:inline>
+        </w:drawing>
+      </w:r>
+      <w:proofErr w:type="gramStart"/>
+      <w:r>
+        <w:t>there</w:t>
+      </w:r>
+      <w:proofErr w:type="gramEnd"/>
+      <w:r>
+        <w:t xml:space="preserve"> should be the forgot password thing and will get to reset the password using his email</w:t>
       </w:r>
     </w:p>
     <w:sectPr>
@@ -1335,7 +1670,7 @@
   <a:extraClrSchemeLst/>
   <a:extLst>
     <a:ext uri="{05A4C25C-085E-4340-85A3-A5531E510DB2}">
-      <thm15:themeFamily xmlns:thm15="http://schemas.microsoft.com/office/thememl/2012/main" xmlns="" name="Office Theme" id="{62F939B6-93AF-4DB8-9C6B-D6C7DFDC589F}" vid="{4A3C46E8-61CC-4603-A589-7422A47A8E4A}"/>
+      <thm15:themeFamily xmlns="" xmlns:thm15="http://schemas.microsoft.com/office/thememl/2012/main" name="Office Theme" id="{62F939B6-93AF-4DB8-9C6B-D6C7DFDC589F}" vid="{4A3C46E8-61CC-4603-A589-7422A47A8E4A}"/>
     </a:ext>
   </a:extLst>
 </a:theme>

</xml_diff>

<commit_message>
read-only on the Edit & Resubmit page
</commit_message>
<xml_diff>
--- a/changes to make and log.docx
+++ b/changes to make and log.docx
@@ -2071,7 +2071,15 @@
         </w:tabs>
       </w:pPr>
       <w:r>
-        <w:t>Added Stage 1 fields: synopsis, pptFilePath, problemStatement, objectives, literatureReview, methodology, systemDesign, and </w:t>
+        <w:t>Added Stage 1 fields: synopsis, pptFilePath, problemStatement, objectives, literatureReview, methodology, </w:t>
+      </w:r>
+      <w:proofErr w:type="spellStart"/>
+      <w:r>
+        <w:t>systemDesign</w:t>
+      </w:r>
+      <w:proofErr w:type="spellEnd"/>
+      <w:r>
+        <w:t>, and </w:t>
       </w:r>
       <w:proofErr w:type="spellStart"/>
       <w:r>
@@ -2797,6 +2805,57 @@
           <w:tab w:val="left" w:pos="2288"/>
         </w:tabs>
       </w:pPr>
+      <w:r>
+        <w:rPr>
+          <w:noProof/>
+        </w:rPr>
+        <w:lastRenderedPageBreak/>
+        <w:drawing>
+          <wp:inline distT="0" distB="0" distL="0" distR="0">
+            <wp:extent cx="5943600" cy="2890881"/>
+            <wp:effectExtent l="19050" t="0" r="0" b="0"/>
+            <wp:docPr id="8" name="Picture 12"/>
+            <wp:cNvGraphicFramePr>
+              <a:graphicFrameLocks xmlns:a="http://schemas.openxmlformats.org/drawingml/2006/main" noChangeAspect="1"/>
+            </wp:cNvGraphicFramePr>
+            <a:graphic xmlns:a="http://schemas.openxmlformats.org/drawingml/2006/main">
+              <a:graphicData uri="http://schemas.openxmlformats.org/drawingml/2006/picture">
+                <pic:pic xmlns:pic="http://schemas.openxmlformats.org/drawingml/2006/picture">
+                  <pic:nvPicPr>
+                    <pic:cNvPr id="0" name="Picture 12"/>
+                    <pic:cNvPicPr>
+                      <a:picLocks noChangeAspect="1" noChangeArrowheads="1"/>
+                    </pic:cNvPicPr>
+                  </pic:nvPicPr>
+                  <pic:blipFill>
+                    <a:blip r:embed="rId19" cstate="print"/>
+                    <a:srcRect/>
+                    <a:stretch>
+                      <a:fillRect/>
+                    </a:stretch>
+                  </pic:blipFill>
+                  <pic:spPr bwMode="auto">
+                    <a:xfrm>
+                      <a:off x="0" y="0"/>
+                      <a:ext cx="5943600" cy="2890881"/>
+                    </a:xfrm>
+                    <a:prstGeom prst="rect">
+                      <a:avLst/>
+                    </a:prstGeom>
+                    <a:noFill/>
+                    <a:ln w="9525">
+                      <a:noFill/>
+                      <a:miter lim="800000"/>
+                      <a:headEnd/>
+                      <a:tailEnd/>
+                    </a:ln>
+                  </pic:spPr>
+                </pic:pic>
+              </a:graphicData>
+            </a:graphic>
+          </wp:inline>
+        </w:drawing>
+      </w:r>
     </w:p>
     <w:sectPr>
       <w:pgSz w:w="12240" w:h="15840"/>
@@ -3148,6 +3207,7 @@
   <w:style w:type="character" w:default="1" w:styleId="DefaultParagraphFont">
     <w:name w:val="Default Paragraph Font"/>
     <w:uiPriority w:val="1"/>
+    <w:semiHidden/>
     <w:unhideWhenUsed/>
   </w:style>
   <w:style w:type="table" w:default="1" w:styleId="TableNormal">
@@ -3568,7 +3628,7 @@
   <a:extraClrSchemeLst/>
   <a:extLst>
     <a:ext uri="{05A4C25C-085E-4340-85A3-A5531E510DB2}">
-      <thm15:themeFamily xmlns:thm15="http://schemas.microsoft.com/office/thememl/2012/main" xmlns="" name="Office Theme" id="{62F939B6-93AF-4DB8-9C6B-D6C7DFDC589F}" vid="{4A3C46E8-61CC-4603-A589-7422A47A8E4A}"/>
+      <thm15:themeFamily xmlns="" xmlns:thm15="http://schemas.microsoft.com/office/thememl/2012/main" name="Office Theme" id="{62F939B6-93AF-4DB8-9C6B-D6C7DFDC589F}" vid="{4A3C46E8-61CC-4603-A589-7422A47A8E4A}"/>
     </a:ext>
   </a:extLst>
 </a:theme>

</xml_diff>